<commit_message>
Harden template rejection; resolve ticket 03
</commit_message>
<xml_diff>
--- a/public/admin/manuscript-template.docx
+++ b/public/admin/manuscript-template.docx
@@ -20,7 +20,7 @@
     </w:p>
     <w:p>
       <w:pPr>
-        <w:pStyle w:val="BodyText"/>
+        <w:pStyle w:val="Normal"/>
       </w:pPr>
       <w:commentRangeStart w:id="1"/>
       <w:r>
@@ -53,7 +53,7 @@
     </w:p>
     <w:p>
       <w:pPr>
-        <w:pStyle w:val="FirstParagraph"/>
+        <w:pStyle w:val="Normal"/>
       </w:pPr>
       <w:commentRangeStart w:id="3"/>
       <w:r>

</xml_diff>